<commit_message>
refactor/move validators to validation.py
</commit_message>
<xml_diff>
--- a/planning/Test plan.docx
+++ b/planning/Test plan.docx
@@ -8641,8 +8641,200 @@
                 <w:lang w:eastAsia="en-GB"/>
                 <w14:ligatures w14:val="none"/>
               </w:rPr>
-              <w:t>Create 3 tasks and retrieve 1 by priority</w:t>
-            </w:r>
+              <w:t>Create 4 tasks in the following order:</w:t>
+            </w:r>
+          </w:p>
+          <w:p>
+            <w:pPr>
+              <w:spacing w:after="0" w:line="240" w:lineRule="auto"/>
+              <w:rPr>
+                <w:rFonts w:ascii="Aptos Narrow" w:eastAsia="Times New Roman" w:hAnsi="Aptos Narrow" w:cs="Times New Roman"/>
+                <w:color w:val="000000"/>
+                <w:kern w:val="0"/>
+                <w:sz w:val="22"/>
+                <w:szCs w:val="22"/>
+                <w:lang w:eastAsia="en-GB"/>
+                <w14:ligatures w14:val="none"/>
+              </w:rPr>
+            </w:pPr>
+          </w:p>
+          <w:p>
+            <w:pPr>
+              <w:spacing w:after="0" w:line="240" w:lineRule="auto"/>
+              <w:rPr>
+                <w:rFonts w:ascii="Aptos Narrow" w:eastAsia="Times New Roman" w:hAnsi="Aptos Narrow" w:cs="Times New Roman"/>
+                <w:color w:val="000000"/>
+                <w:kern w:val="0"/>
+                <w:sz w:val="22"/>
+                <w:szCs w:val="22"/>
+                <w:lang w:eastAsia="en-GB"/>
+                <w14:ligatures w14:val="none"/>
+              </w:rPr>
+            </w:pPr>
+            <w:r>
+              <w:rPr>
+                <w:rFonts w:ascii="Aptos Narrow" w:eastAsia="Times New Roman" w:hAnsi="Aptos Narrow" w:cs="Times New Roman"/>
+                <w:color w:val="000000"/>
+                <w:kern w:val="0"/>
+                <w:sz w:val="22"/>
+                <w:szCs w:val="22"/>
+                <w:lang w:eastAsia="en-GB"/>
+                <w14:ligatures w14:val="none"/>
+              </w:rPr>
+              <w:t xml:space="preserve">Priority: </w:t>
+            </w:r>
+            <w:r>
+              <w:rPr>
+                <w:rFonts w:ascii="Aptos Narrow" w:eastAsia="Times New Roman" w:hAnsi="Aptos Narrow" w:cs="Times New Roman"/>
+                <w:color w:val="000000"/>
+                <w:kern w:val="0"/>
+                <w:sz w:val="22"/>
+                <w:szCs w:val="22"/>
+                <w:lang w:eastAsia="en-GB"/>
+                <w14:ligatures w14:val="none"/>
+              </w:rPr>
+              <w:t>3</w:t>
+            </w:r>
+            <w:r>
+              <w:rPr>
+                <w:rFonts w:ascii="Aptos Narrow" w:eastAsia="Times New Roman" w:hAnsi="Aptos Narrow" w:cs="Times New Roman"/>
+                <w:color w:val="000000"/>
+                <w:kern w:val="0"/>
+                <w:sz w:val="22"/>
+                <w:szCs w:val="22"/>
+                <w:lang w:eastAsia="en-GB"/>
+                <w14:ligatures w14:val="none"/>
+              </w:rPr>
+              <w:t xml:space="preserve"> (incomplete)</w:t>
+            </w:r>
+          </w:p>
+          <w:p>
+            <w:pPr>
+              <w:spacing w:after="0" w:line="240" w:lineRule="auto"/>
+              <w:rPr>
+                <w:rFonts w:ascii="Aptos Narrow" w:eastAsia="Times New Roman" w:hAnsi="Aptos Narrow" w:cs="Times New Roman"/>
+                <w:color w:val="000000"/>
+                <w:kern w:val="0"/>
+                <w:sz w:val="22"/>
+                <w:szCs w:val="22"/>
+                <w:lang w:eastAsia="en-GB"/>
+                <w14:ligatures w14:val="none"/>
+              </w:rPr>
+            </w:pPr>
+            <w:r>
+              <w:rPr>
+                <w:rFonts w:ascii="Aptos Narrow" w:eastAsia="Times New Roman" w:hAnsi="Aptos Narrow" w:cs="Times New Roman"/>
+                <w:color w:val="000000"/>
+                <w:kern w:val="0"/>
+                <w:sz w:val="22"/>
+                <w:szCs w:val="22"/>
+                <w:lang w:eastAsia="en-GB"/>
+                <w14:ligatures w14:val="none"/>
+              </w:rPr>
+              <w:t>Priority: 1 (incomplete)</w:t>
+            </w:r>
+          </w:p>
+          <w:p>
+            <w:pPr>
+              <w:spacing w:after="0" w:line="240" w:lineRule="auto"/>
+              <w:rPr>
+                <w:rFonts w:ascii="Aptos Narrow" w:eastAsia="Times New Roman" w:hAnsi="Aptos Narrow" w:cs="Times New Roman"/>
+                <w:color w:val="000000"/>
+                <w:kern w:val="0"/>
+                <w:sz w:val="22"/>
+                <w:szCs w:val="22"/>
+                <w:lang w:eastAsia="en-GB"/>
+                <w14:ligatures w14:val="none"/>
+              </w:rPr>
+            </w:pPr>
+            <w:r>
+              <w:rPr>
+                <w:rFonts w:ascii="Aptos Narrow" w:eastAsia="Times New Roman" w:hAnsi="Aptos Narrow" w:cs="Times New Roman"/>
+                <w:color w:val="000000"/>
+                <w:kern w:val="0"/>
+                <w:sz w:val="22"/>
+                <w:szCs w:val="22"/>
+                <w:lang w:eastAsia="en-GB"/>
+                <w14:ligatures w14:val="none"/>
+              </w:rPr>
+              <w:t xml:space="preserve">Priority: </w:t>
+            </w:r>
+            <w:r>
+              <w:rPr>
+                <w:rFonts w:ascii="Aptos Narrow" w:eastAsia="Times New Roman" w:hAnsi="Aptos Narrow" w:cs="Times New Roman"/>
+                <w:color w:val="000000"/>
+                <w:kern w:val="0"/>
+                <w:sz w:val="22"/>
+                <w:szCs w:val="22"/>
+                <w:lang w:eastAsia="en-GB"/>
+                <w14:ligatures w14:val="none"/>
+              </w:rPr>
+              <w:t>4</w:t>
+            </w:r>
+            <w:r>
+              <w:rPr>
+                <w:rFonts w:ascii="Aptos Narrow" w:eastAsia="Times New Roman" w:hAnsi="Aptos Narrow" w:cs="Times New Roman"/>
+                <w:color w:val="000000"/>
+                <w:kern w:val="0"/>
+                <w:sz w:val="22"/>
+                <w:szCs w:val="22"/>
+                <w:lang w:eastAsia="en-GB"/>
+                <w14:ligatures w14:val="none"/>
+              </w:rPr>
+              <w:t xml:space="preserve"> (complete)</w:t>
+            </w:r>
+          </w:p>
+          <w:p>
+            <w:pPr>
+              <w:spacing w:after="0" w:line="240" w:lineRule="auto"/>
+              <w:rPr>
+                <w:rFonts w:ascii="Aptos Narrow" w:eastAsia="Times New Roman" w:hAnsi="Aptos Narrow" w:cs="Times New Roman"/>
+                <w:color w:val="000000"/>
+                <w:kern w:val="0"/>
+                <w:sz w:val="22"/>
+                <w:szCs w:val="22"/>
+                <w:lang w:eastAsia="en-GB"/>
+                <w14:ligatures w14:val="none"/>
+              </w:rPr>
+            </w:pPr>
+            <w:r>
+              <w:rPr>
+                <w:rFonts w:ascii="Aptos Narrow" w:eastAsia="Times New Roman" w:hAnsi="Aptos Narrow" w:cs="Times New Roman"/>
+                <w:color w:val="000000"/>
+                <w:kern w:val="0"/>
+                <w:sz w:val="22"/>
+                <w:szCs w:val="22"/>
+                <w:lang w:eastAsia="en-GB"/>
+                <w14:ligatures w14:val="none"/>
+              </w:rPr>
+              <w:t xml:space="preserve">Priority: </w:t>
+            </w:r>
+            <w:r>
+              <w:rPr>
+                <w:rFonts w:ascii="Aptos Narrow" w:eastAsia="Times New Roman" w:hAnsi="Aptos Narrow" w:cs="Times New Roman"/>
+                <w:color w:val="000000"/>
+                <w:kern w:val="0"/>
+                <w:sz w:val="22"/>
+                <w:szCs w:val="22"/>
+                <w:lang w:eastAsia="en-GB"/>
+                <w14:ligatures w14:val="none"/>
+              </w:rPr>
+              <w:t>2</w:t>
+            </w:r>
+          </w:p>
+          <w:p>
+            <w:pPr>
+              <w:spacing w:after="0" w:line="240" w:lineRule="auto"/>
+              <w:rPr>
+                <w:rFonts w:ascii="Aptos Narrow" w:eastAsia="Times New Roman" w:hAnsi="Aptos Narrow" w:cs="Times New Roman"/>
+                <w:color w:val="000000"/>
+                <w:kern w:val="0"/>
+                <w:sz w:val="22"/>
+                <w:szCs w:val="22"/>
+                <w:lang w:eastAsia="en-GB"/>
+                <w14:ligatures w14:val="none"/>
+              </w:rPr>
+            </w:pPr>
           </w:p>
         </w:tc>
         <w:tc>
@@ -8760,7 +8952,43 @@
                 <w:lang w:eastAsia="en-GB"/>
                 <w14:ligatures w14:val="none"/>
               </w:rPr>
-              <w:t>When retrieve task by priority is called 3 times, each of the tasks, including the retrieved task, are retrieved and printed</w:t>
+              <w:t xml:space="preserve">When retrieve task by priority is called </w:t>
+            </w:r>
+            <w:r>
+              <w:rPr>
+                <w:rFonts w:ascii="Aptos Narrow" w:eastAsia="Times New Roman" w:hAnsi="Aptos Narrow" w:cs="Times New Roman"/>
+                <w:color w:val="000000"/>
+                <w:kern w:val="0"/>
+                <w:sz w:val="22"/>
+                <w:szCs w:val="22"/>
+                <w:lang w:eastAsia="en-GB"/>
+                <w14:ligatures w14:val="none"/>
+              </w:rPr>
+              <w:t>4</w:t>
+            </w:r>
+            <w:r>
+              <w:rPr>
+                <w:rFonts w:ascii="Aptos Narrow" w:eastAsia="Times New Roman" w:hAnsi="Aptos Narrow" w:cs="Times New Roman"/>
+                <w:color w:val="000000"/>
+                <w:kern w:val="0"/>
+                <w:sz w:val="22"/>
+                <w:szCs w:val="22"/>
+                <w:lang w:eastAsia="en-GB"/>
+                <w14:ligatures w14:val="none"/>
+              </w:rPr>
+              <w:t xml:space="preserve"> times, each of the tasks</w:t>
+            </w:r>
+            <w:r>
+              <w:rPr>
+                <w:rFonts w:ascii="Aptos Narrow" w:eastAsia="Times New Roman" w:hAnsi="Aptos Narrow" w:cs="Times New Roman"/>
+                <w:color w:val="000000"/>
+                <w:kern w:val="0"/>
+                <w:sz w:val="22"/>
+                <w:szCs w:val="22"/>
+                <w:lang w:eastAsia="en-GB"/>
+                <w14:ligatures w14:val="none"/>
+              </w:rPr>
+              <w:t xml:space="preserve"> should be returned in order of priorities 1 – 4</w:t>
             </w:r>
           </w:p>
         </w:tc>
@@ -10446,7 +10674,20 @@
                 <w:lang w:eastAsia="en-GB"/>
                 <w14:ligatures w14:val="none"/>
               </w:rPr>
-              <w:t xml:space="preserve">Observe the time taken to mark a task as complete when there are </w:t>
+              <w:t xml:space="preserve">Observe the time taken to mark a task as complete when </w:t>
+            </w:r>
+            <w:r>
+              <w:rPr>
+                <w:rFonts w:ascii="Aptos Narrow" w:eastAsia="Times New Roman" w:hAnsi="Aptos Narrow" w:cs="Times New Roman"/>
+                <w:color w:val="000000"/>
+                <w:kern w:val="0"/>
+                <w:sz w:val="22"/>
+                <w:szCs w:val="22"/>
+                <w:lang w:eastAsia="en-GB"/>
+                <w14:ligatures w14:val="none"/>
+              </w:rPr>
+              <w:lastRenderedPageBreak/>
+              <w:t xml:space="preserve">there are </w:t>
             </w:r>
             <w:r>
               <w:rPr>
@@ -10507,6 +10748,7 @@
                 <w:lang w:eastAsia="en-GB"/>
                 <w14:ligatures w14:val="none"/>
               </w:rPr>
+              <w:lastRenderedPageBreak/>
               <w:t>Procedurally create 10000 tasks</w:t>
             </w:r>
           </w:p>
@@ -11132,7 +11374,6 @@
                 <w:lang w:eastAsia="en-GB"/>
                 <w14:ligatures w14:val="none"/>
               </w:rPr>
-              <w:lastRenderedPageBreak/>
               <w:t>U1</w:t>
             </w:r>
           </w:p>

</xml_diff>